<commit_message>
Completa las citas de tablas y referencias en el documento del Proyecto 3
La norma de formato del curso exige que las tablas esten numeradas Y
referenciadas en el texto, y que toda fuente listada en la seccion 10 aparezca
citada en el cuerpo. La revision detecto dos incumplimientos:

- 8 de las 13 tablas no se citaban: la 2, las 5 a 8, la 9, la 10 y la 13.
  Ahora cada una se menciona explicitamente donde corresponde.

- Las referencias [2] (Tanenbaum) y [4] (ISO/IEC 25010) estaban listadas pero
  nunca citadas. Se cita Tanenbaum al describir FIFO y la norma ISO al abrir
  la autoevaluacion.

Se verifico ademas que las 10 secciones estan en el orden de la plantilla, que
la autoevaluacion usa exactamente las 5 caracteristicas de la rubrica del curso
y que las cifras del documento coinciden con evidencia/resultados.csv.

Co-Authored-By: Claude Opus 5 <noreply@anthropic.com>
</commit_message>
<xml_diff>
--- a/proyecto3-memoria/docs/Proyecto3_ReemplazoPaginas_IEEE.docx
+++ b/proyecto3-memoria/docs/Proyecto3_ReemplazoPaginas_IEEE.docx
@@ -623,7 +623,7 @@
           <w:sz w:val="19"/>
           <w:szCs w:val="19"/>
         </w:rPr>
-        <w:t xml:space="preserve">FIFO desaloja la página que lleva más tiempo cargada en memoria, con independencia de su uso reciente. Su atractivo es la simplicidad: basta una cola. Su debilidad es que la antigüedad de carga no guarda relación con la probabilidad de uso futuro, de modo que puede desalojar una página muy utilizada solo por haber entrado temprano.</w:t>
+        <w:t xml:space="preserve">FIFO desaloja la página que lleva más tiempo cargada en memoria, con independencia de su uso reciente. Su atractivo es la simplicidad: basta una cola [2]. Su debilidad es que la antigüedad de carga no guarda relación con la probabilidad de uso futuro, de modo que puede desalojar una página muy utilizada solo por haber entrado temprano.</w:t>
       </w:r>
     </w:p>
     <w:p>
@@ -1596,7 +1596,7 @@
           <w:sz w:val="19"/>
           <w:szCs w:val="19"/>
         </w:rPr>
-        <w:t xml:space="preserve">El proyecto está escrito en C++17 y utiliza exclusivamente la biblioteca estándar, sin dependencias externas. Compila con un único comando y no produce advertencias bajo -Wall -Wextra.</w:t>
+        <w:t xml:space="preserve">El proyecto está escrito en C++17 y utiliza exclusivamente la biblioteca estándar, sin dependencias externas. Compila con un único comando y no produce advertencias bajo -Wall -Wextra. La Tabla 2 resume la responsabilidad de cada archivo fuente.</w:t>
       </w:r>
     </w:p>
     <w:p>
@@ -3664,7 +3664,7 @@
           <w:sz w:val="19"/>
           <w:szCs w:val="19"/>
         </w:rPr>
-        <w:t xml:space="preserve">Las tablas siguientes recogen el número de fallos de cada algoritmo para cada tamaño de marco evaluado, con indicación del mejor en cada fila.</w:t>
+        <w:t xml:space="preserve">Las Tablas 5 a 8 recogen el número de fallos de cada algoritmo para cada tamaño de marco evaluado, con indicación del mejor en cada fila. Cada una corresponde a una cadena distinta, de modo que las columnas resultan directamente comparables dentro de cada tabla.</w:t>
       </w:r>
     </w:p>
     <w:p>
@@ -7364,7 +7364,7 @@
           <w:sz w:val="19"/>
           <w:szCs w:val="19"/>
         </w:rPr>
-        <w:t xml:space="preserve">La comparación directa entre los tres patrones, a igualdad de marcos, permite contrastar la afirmación de que LRU aventaja a FIFO únicamente en presencia de localidad.</w:t>
+        <w:t xml:space="preserve">La comparación directa entre los tres patrones, a igualdad de marcos, permite contrastar la afirmación de que LRU aventaja a FIFO únicamente en presencia de localidad. La Tabla 9 la resume.</w:t>
       </w:r>
     </w:p>
     <w:p>
@@ -8037,7 +8037,7 @@
           <w:sz w:val="19"/>
           <w:szCs w:val="19"/>
         </w:rPr>
-        <w:t xml:space="preserve">Se construyó una cadena específica para provocar la anomalía. Los resultados confirman su existencia sobre FIFO y su ausencia sobre LRU.</w:t>
+        <w:t xml:space="preserve">Se construyó una cadena específica para provocar la anomalía. Los resultados de la Tabla 10 confirman su existencia sobre FIFO y su ausencia sobre LRU.</w:t>
       </w:r>
     </w:p>
     <w:p>
@@ -9575,7 +9575,7 @@
           <w:sz w:val="19"/>
           <w:szCs w:val="19"/>
         </w:rPr>
-        <w:t xml:space="preserve">Autoevaluación conforme a la rúbrica institucional, en escala de Excelente (4) a Insuficiente (1), justificada con evidencia propia del proyecto.</w:t>
+        <w:t xml:space="preserve">Autoevaluación conforme a la rúbrica institucional del curso, que aplica un modelo simplificado de cinco características derivado de la norma ISO/IEC 25010 [4], en escala de Excelente (4) a Insuficiente (1). La Tabla 13 recoge la calificación de cada característica junto con la evidencia propia del proyecto que la respalda.</w:t>
       </w:r>
     </w:p>
     <w:p>

</xml_diff>